<commit_message>
fix(templates): igualar el espaciado de la firma en el TPL de GENERIC
El builder posicional calculaba el hueco antes de la firma con
`keep_empty = max(0, 30 - closing_idx - 2)`, que da 5-7 lineas vacias
para una carta tipica. El TPL tenia 2, asi que la firma subia ~45px
respecto de la carta original.

Fijado en 5, que es el caso de 3 juegos. Queda documentado en el script
que el anclaje dinamico no se puede replicar de forma declarativa.

Co-Authored-By: Claude Opus 4.8 <noreply@anthropic.com>
</commit_message>
<xml_diff>
--- a/templates/GENERIC_TEMPLATE_TPL.docx
+++ b/templates/GENERIC_TEMPLATE_TPL.docx
@@ -385,6 +385,42 @@
         </w:rPr>
         <w:t>We wish you the best in your preparation and accomplishment of your assignment.</w:t>
       </w:r>
+    </w:p>
+    <w:p>
+      <w:pPr>
+        <w:spacing w:before="100" w:beforeAutospacing="1" w:after="100" w:afterAutospacing="1"/>
+        <w:contextualSpacing/>
+        <w:rPr>
+          <w:rFonts w:ascii="Univers" w:hAnsi="Univers"/>
+          <w:color w:val="EE0000"/>
+          <w:sz w:val="22"/>
+          <w:lang w:eastAsia="de-DE"/>
+        </w:rPr>
+      </w:pPr>
+    </w:p>
+    <w:p>
+      <w:pPr>
+        <w:spacing w:before="100" w:beforeAutospacing="1" w:after="100" w:afterAutospacing="1"/>
+        <w:contextualSpacing/>
+        <w:rPr>
+          <w:rFonts w:ascii="Univers" w:hAnsi="Univers"/>
+          <w:color w:val="EE0000"/>
+          <w:sz w:val="22"/>
+          <w:lang w:eastAsia="de-DE"/>
+        </w:rPr>
+      </w:pPr>
+    </w:p>
+    <w:p>
+      <w:pPr>
+        <w:spacing w:before="100" w:beforeAutospacing="1" w:after="100" w:afterAutospacing="1"/>
+        <w:contextualSpacing/>
+        <w:rPr>
+          <w:rFonts w:ascii="Univers" w:hAnsi="Univers"/>
+          <w:color w:val="EE0000"/>
+          <w:sz w:val="22"/>
+          <w:lang w:eastAsia="de-DE"/>
+        </w:rPr>
+      </w:pPr>
     </w:p>
     <w:p>
       <w:pPr>

</xml_diff>

<commit_message>
feat(templates): migrar WCQ a placeholders y unificar el generador
Segundo paso hacia la subida de templates. WCQ era casi identico a
GENERIC salvo la fuente (IBM Plex Sans), la fecha en rojo, el titulo con
logo en [0] que se conserva, y el estilo "List Paragraph" en las lineas
de fee.

- scripts/build_generic_tpl.py -> scripts/build_letter_templates.py, con
  un spec por template y el cuerpo compartido en nomination_body().
- letter_date pasa a RichText para poder pintarlo por template
  (_letter_context recibe date_color).
- _build_doc usa WCQ_TEMPLATE_TPL.docx si existe, con fallback al
  builder posicional.

Verificado contra los builders viejos con los mismos datos: texto
identico en los dos (GENERIC 17 lineas, WCQ 16) y mismos colores,
negritas y tamanos. Solo difiere como se parte en runs un parrafo.

Faltan BCLA (tiene variantes F4/RS y lineas condicionales) y LSB (se
arma entero por codigo).

Co-Authored-By: Claude Opus 4.8 <noreply@anthropic.com>
</commit_message>
<xml_diff>
--- a/templates/GENERIC_TEMPLATE_TPL.docx
+++ b/templates/GENERIC_TEMPLATE_TPL.docx
@@ -17,11 +17,10 @@
       <w:r>
         <w:rPr>
           <w:rFonts w:ascii="Univers" w:hAnsi="Univers"/>
-          <w:b w:val="0"/>
           <w:color w:val="2A2A2A"/>
           <w:sz w:val="20"/>
         </w:rPr>
-        <w:t>{{ letter_date }}</w:t>
+        <w:t>{{r letter_date }}</w:t>
       </w:r>
     </w:p>
     <w:p>
@@ -50,7 +49,6 @@
       <w:r>
         <w:rPr>
           <w:rFonts w:ascii="Univers" w:hAnsi="Univers"/>
-          <w:b w:val="0"/>
           <w:color w:val="2A2A2A"/>
         </w:rPr>
         <w:t>Dear {{r nominee }},</w:t>
@@ -82,7 +80,6 @@
       <w:r>
         <w:rPr>
           <w:rFonts w:ascii="Univers" w:hAnsi="Univers"/>
-          <w:b w:val="0"/>
           <w:color w:val="2A2A2A"/>
         </w:rPr>
         <w:t>We would like to inform that you have been nominated for the following games of the {{ competition_name }}.</w:t>
@@ -114,7 +111,6 @@
       <w:r>
         <w:rPr>
           <w:rFonts w:ascii="Univers" w:hAnsi="Univers"/>
-          <w:b w:val="0"/>
           <w:color w:val="2A2A2A"/>
         </w:rPr>
         <w:t>{%p for game in game_dates %}</w:t>
@@ -135,7 +131,6 @@
       <w:r>
         <w:rPr>
           <w:rFonts w:ascii="Univers" w:hAnsi="Univers"/>
-          <w:b w:val="0"/>
           <w:color w:val="2A2A2A"/>
           <w:sz w:val="20"/>
         </w:rPr>
@@ -156,7 +151,6 @@
       <w:r>
         <w:rPr>
           <w:rFonts w:ascii="Univers" w:hAnsi="Univers"/>
-          <w:b w:val="0"/>
           <w:color w:val="2A2A2A"/>
         </w:rPr>
         <w:t>{%p endfor %}</w:t>
@@ -177,7 +171,6 @@
       <w:r>
         <w:rPr>
           <w:rFonts w:ascii="Univers" w:hAnsi="Univers"/>
-          <w:b w:val="0"/>
           <w:color w:val="2A2A2A"/>
           <w:sz w:val="20"/>
         </w:rPr>
@@ -211,7 +204,6 @@
       <w:r>
         <w:rPr>
           <w:rFonts w:ascii="Univers" w:hAnsi="Univers"/>
-          <w:b w:val="0"/>
           <w:color w:val="2A2A2A"/>
         </w:rPr>
         <w:t>As per the FIBA Internal Regulations Book 3, please confirm to us your availability to fulfil your assignment as {{ role_label }} by {{r deadline }}. Confirmation shall be sent to {{ confirm_email }}</w:t>
@@ -243,7 +235,6 @@
       <w:r>
         <w:rPr>
           <w:rFonts w:ascii="Univers" w:hAnsi="Univers"/>
-          <w:b w:val="0"/>
           <w:color w:val="2A2A2A"/>
         </w:rPr>
         <w:t>As soon as we receive your confirmation, we will make arrangements for international flights to the host country and provide you with relevant information in order for you to prepare the game and establish contact with the Game Director of the Host National Federation.</w:t>
@@ -275,7 +266,6 @@
       <w:r>
         <w:rPr>
           <w:rFonts w:ascii="Univers" w:hAnsi="Univers"/>
-          <w:b w:val="0"/>
           <w:color w:val="2A2A2A"/>
         </w:rPr>
         <w:t>Below list the details of payment you will receive as {{ role_label }} assigned to the competition listed above:</w:t>
@@ -307,7 +297,6 @@
       <w:r>
         <w:rPr>
           <w:rFonts w:ascii="Univers" w:hAnsi="Univers"/>
-          <w:b w:val="0"/>
           <w:color w:val="2A2A2A"/>
         </w:rPr>
         <w:t>{%p for fee in fee_lines %}</w:t>
@@ -327,7 +316,6 @@
       <w:r>
         <w:rPr>
           <w:rFonts w:ascii="Univers" w:hAnsi="Univers"/>
-          <w:b w:val="0"/>
           <w:color w:val="2A2A2A"/>
           <w:sz w:val="20"/>
         </w:rPr>
@@ -348,7 +336,6 @@
       <w:r>
         <w:rPr>
           <w:rFonts w:ascii="Univers" w:hAnsi="Univers"/>
-          <w:b w:val="0"/>
           <w:color w:val="2A2A2A"/>
         </w:rPr>
         <w:t>{%p endfor %}</w:t>
@@ -380,7 +367,6 @@
       <w:r>
         <w:rPr>
           <w:rFonts w:ascii="Univers" w:hAnsi="Univers"/>
-          <w:b w:val="0"/>
           <w:color w:val="2A2A2A"/>
         </w:rPr>
         <w:t>We wish you the best in your preparation and accomplishment of your assignment.</w:t>

</xml_diff>

<commit_message>
fix(templates): corregir el espaciado de WCQ y GENERIC en los TPL
Comparando los PDF renderizados de WCQ (viejo vs nuevo) aparecio que el
cuerpo bajaba una linea y el cierre subia una. Tres gaps mal:

- fecha -> "Dear": WCQ no lleva linea en blanco (su fecha esta en
  paras[1] y "Dear" en [2]); GENERIC si. Ahora es un parametro.
- "Below list..." -> fees: son 2 lineas, no 1 (old: fee_idx =
  payment_idx + 3).
- ultimo fee -> cierre: son 2 lineas, no 1 (old: closing_idx = fee_idx +
  len(fees) + 2).

GENERIC arrastraba los dos ultimos desde el piloto. No se habia detectado
porque la comparacion filtraba los parrafos vacios y miraba solo lineas
con texto. Ahora se compara la secuencia completa de parrafos, vacios
incluidos, y ademas se verifica sobre el PDF renderizado.

Co-Authored-By: Claude Opus 4.8 <noreply@anthropic.com>
</commit_message>
<xml_diff>
--- a/templates/GENERIC_TEMPLATE_TPL.docx
+++ b/templates/GENERIC_TEMPLATE_TPL.docx
@@ -294,6 +294,18 @@
           <w:lang w:eastAsia="de-DE"/>
         </w:rPr>
       </w:pPr>
+    </w:p>
+    <w:p>
+      <w:pPr>
+        <w:spacing w:before="100" w:beforeAutospacing="1" w:after="100" w:afterAutospacing="1"/>
+        <w:contextualSpacing/>
+        <w:rPr>
+          <w:rFonts w:ascii="Univers" w:hAnsi="Univers"/>
+          <w:color w:val="EE0000"/>
+          <w:sz w:val="22"/>
+          <w:lang w:eastAsia="de-DE"/>
+        </w:rPr>
+      </w:pPr>
       <w:r>
         <w:rPr>
           <w:rFonts w:ascii="Univers" w:hAnsi="Univers"/>
@@ -340,6 +352,18 @@
         </w:rPr>
         <w:t>{%p endfor %}</w:t>
       </w:r>
+    </w:p>
+    <w:p>
+      <w:pPr>
+        <w:spacing w:before="100" w:beforeAutospacing="1" w:after="100" w:afterAutospacing="1"/>
+        <w:contextualSpacing/>
+        <w:rPr>
+          <w:rFonts w:ascii="Univers" w:hAnsi="Univers"/>
+          <w:color w:val="EE0000"/>
+          <w:sz w:val="22"/>
+          <w:lang w:eastAsia="de-DE"/>
+        </w:rPr>
+      </w:pPr>
     </w:p>
     <w:p>
       <w:pPr>

</xml_diff>

<commit_message>
fix(templates): no repintar la firma ni el footer en los TPL
El diff de PDF de GENERIC mostro 5 spans distintos: la firma y dos lineas
del footer pasaban de negro puro (#000000) a tinta (#2A2A2A). Lo causaba
haber fijado el color en el estilo Normal del documento, que era un
parche para que el texto que sigue a un {{r }} no perdiera el color.

Se ataca la causa: los parrafos que mezclan tintas (el saludo y la linea
de confirmacion) pasan a ser un unico RichText armado en el contexto
(dear_line, confirm_line), asi no queda texto suelto heredando nada. Con
eso el TPL ya solo fija la fuente por defecto, igual que los builders
posicionales.

Co-Authored-By: Claude Opus 4.8 <noreply@anthropic.com>
</commit_message>
<xml_diff>
--- a/templates/GENERIC_TEMPLATE_TPL.docx
+++ b/templates/GENERIC_TEMPLATE_TPL.docx
@@ -51,7 +51,7 @@
           <w:rFonts w:ascii="Univers" w:hAnsi="Univers"/>
           <w:color w:val="2A2A2A"/>
         </w:rPr>
-        <w:t>Dear {{r nominee }},</w:t>
+        <w:t>{{r dear_line }}</w:t>
       </w:r>
     </w:p>
     <w:p>
@@ -206,7 +206,7 @@
           <w:rFonts w:ascii="Univers" w:hAnsi="Univers"/>
           <w:color w:val="2A2A2A"/>
         </w:rPr>
-        <w:t>As per the FIBA Internal Regulations Book 3, please confirm to us your availability to fulfil your assignment as {{ role_label }} by {{r deadline }}. Confirmation shall be sent to {{ confirm_email }}</w:t>
+        <w:t>{{r confirm_line }}</w:t>
       </w:r>
     </w:p>
     <w:p>
@@ -4377,7 +4377,6 @@
     <w:rsid w:val="00A638EF"/>
     <w:rPr>
       <w:rFonts w:ascii="Univers" w:eastAsia="MS Mincho" w:hAnsi="Univers" w:cs="Times New Roman"/>
-      <w:color w:val="2A2A2A"/>
       <w:sz w:val="20"/>
       <w:lang w:val="en-US"/>
     </w:rPr>
@@ -4398,7 +4397,7 @@
     </w:pPr>
     <w:rPr>
       <w:rFonts w:ascii="Univers" w:eastAsia="MS Gothic" w:hAnsi="Univers"/>
-      <w:color w:val="2A2A2A"/>
+      <w:color w:val="B19E5F" w:themeColor="text2"/>
       <w:sz w:val="64"/>
       <w:szCs w:val="32"/>
     </w:rPr>
@@ -5035,7 +5034,7 @@
     </w:pPr>
     <w:rPr>
       <w:rFonts w:ascii="Univers" w:eastAsia="Times New Roman" w:hAnsi="Univers"/>
-      <w:color w:val="2A2A2A"/>
+      <w:color w:val="000000"/>
       <w:sz w:val="22"/>
       <w:lang w:val="en-GB"/>
     </w:rPr>

</xml_diff>